<commit_message>
docs: fix the contents page, and stop splitting callouts across pages
Word's automatic table of contents renders as an empty page until somebody
presses F9, and the person this guide is written for is exactly the person who
would not know to. Written out by hand instead, with a pointer to the
Navigation Pane.

Also: a callout could break across a page boundary, leaving its heading
stranded at the foot of one page and its coloured edge missing from the top of
the next - now kept whole; the cheat sheet's five acts wrap with a hanging
indent, because that page gets printed; and "point at the THE ESTATE panel"
lost its stutter, in both the Word build and the LaTeX source.

The rendered PDF and the page images were review artifacts and should not have
been committed; removed.

Co-Authored-By: Claude Opus 5 <noreply@anthropic.com>
</commit_message>
<xml_diff>
--- a/docs/demo-guide.docx
+++ b/docs/demo-guide.docx
@@ -126,25 +126,165 @@
         <w:t xml:space="preserve">Contents</w:t>
       </w:r>
     </w:p>
-    <w:sdt>
-      <w:sdtPr>
-        <w:alias w:val="Right-click and choose Update Field to fill this in."/>
-      </w:sdtPr>
-      <w:sdtContent>
-        <w:p>
-          <w:r>
-            <w:fldChar w:fldCharType="begin" w:dirty="true"/>
-            <w:instrText xml:space="preserve">TOC \o "1-2"</w:instrText>
-            <w:fldChar w:fldCharType="separate"/>
-          </w:r>
-        </w:p>
-        <w:p>
-          <w:r>
-            <w:fldChar w:fldCharType="end"/>
-          </w:r>
-        </w:p>
-      </w:sdtContent>
-    </w:sdt>
+    <w:p>
+      <w:pPr>
+        <w:spacing w:after="140"/>
+        <w:ind w:left="260"/>
+      </w:pPr>
+      <w:r>
+        <w:rPr>
+          <w:rFonts w:ascii="Calibri" w:cs="Calibri" w:eastAsia="Calibri" w:hAnsi="Calibri"/>
+          <w:color w:val="1B1F2A"/>
+          <w:sz w:val="22"/>
+          <w:szCs w:val="22"/>
+        </w:rPr>
+        <w:t xml:space="preserve">1.  Read this first</w:t>
+      </w:r>
+    </w:p>
+    <w:p>
+      <w:pPr>
+        <w:spacing w:after="140"/>
+        <w:ind w:left="260"/>
+      </w:pPr>
+      <w:r>
+        <w:rPr>
+          <w:rFonts w:ascii="Calibri" w:cs="Calibri" w:eastAsia="Calibri" w:hAnsi="Calibri"/>
+          <w:color w:val="1B1F2A"/>
+          <w:sz w:val="22"/>
+          <w:szCs w:val="22"/>
+        </w:rPr>
+        <w:t xml:space="preserve">2.  First-time setup (do this the day before)</w:t>
+      </w:r>
+    </w:p>
+    <w:p>
+      <w:pPr>
+        <w:spacing w:after="140"/>
+        <w:ind w:left="260"/>
+      </w:pPr>
+      <w:r>
+        <w:rPr>
+          <w:rFonts w:ascii="Calibri" w:cs="Calibri" w:eastAsia="Calibri" w:hAnsi="Calibri"/>
+          <w:color w:val="1B1F2A"/>
+          <w:sz w:val="22"/>
+          <w:szCs w:val="22"/>
+        </w:rPr>
+        <w:t xml:space="preserve">3.  Pre-flight (30 minutes before the meeting)</w:t>
+      </w:r>
+    </w:p>
+    <w:p>
+      <w:pPr>
+        <w:spacing w:after="140"/>
+        <w:ind w:left="260"/>
+      </w:pPr>
+      <w:r>
+        <w:rPr>
+          <w:rFonts w:ascii="Calibri" w:cs="Calibri" w:eastAsia="Calibri" w:hAnsi="Calibri"/>
+          <w:color w:val="1B1F2A"/>
+          <w:sz w:val="22"/>
+          <w:szCs w:val="22"/>
+        </w:rPr>
+        <w:t xml:space="preserve">4.  The demo script — the part you follow live</w:t>
+      </w:r>
+    </w:p>
+    <w:p>
+      <w:pPr>
+        <w:spacing w:after="140"/>
+        <w:ind w:left="260"/>
+      </w:pPr>
+      <w:r>
+        <w:rPr>
+          <w:rFonts w:ascii="Calibri" w:cs="Calibri" w:eastAsia="Calibri" w:hAnsi="Calibri"/>
+          <w:color w:val="1B1F2A"/>
+          <w:sz w:val="22"/>
+          <w:szCs w:val="22"/>
+        </w:rPr>
+        <w:t xml:space="preserve">5.  What each screen is for</w:t>
+      </w:r>
+    </w:p>
+    <w:p>
+      <w:pPr>
+        <w:spacing w:after="140"/>
+        <w:ind w:left="260"/>
+      </w:pPr>
+      <w:r>
+        <w:rPr>
+          <w:rFonts w:ascii="Calibri" w:cs="Calibri" w:eastAsia="Calibri" w:hAnsi="Calibri"/>
+          <w:color w:val="1B1F2A"/>
+          <w:sz w:val="22"/>
+          <w:szCs w:val="22"/>
+        </w:rPr>
+        <w:t xml:space="preserve">6.  If something goes wrong</w:t>
+      </w:r>
+    </w:p>
+    <w:p>
+      <w:pPr>
+        <w:spacing w:after="140"/>
+        <w:ind w:left="260"/>
+      </w:pPr>
+      <w:r>
+        <w:rPr>
+          <w:rFonts w:ascii="Calibri" w:cs="Calibri" w:eastAsia="Calibri" w:hAnsi="Calibri"/>
+          <w:color w:val="1B1F2A"/>
+          <w:sz w:val="22"/>
+          <w:szCs w:val="22"/>
+        </w:rPr>
+        <w:t xml:space="preserve">7.  Questions a CIO is likely to ask</w:t>
+      </w:r>
+    </w:p>
+    <w:p>
+      <w:pPr>
+        <w:spacing w:after="140"/>
+        <w:ind w:left="260"/>
+      </w:pPr>
+      <w:r>
+        <w:rPr>
+          <w:rFonts w:ascii="Calibri" w:cs="Calibri" w:eastAsia="Calibri" w:hAnsi="Calibri"/>
+          <w:color w:val="1B1F2A"/>
+          <w:sz w:val="22"/>
+          <w:szCs w:val="22"/>
+        </w:rPr>
+        <w:t xml:space="preserve">8.  What not to claim</w:t>
+      </w:r>
+    </w:p>
+    <w:p>
+      <w:pPr>
+        <w:spacing w:after="140"/>
+        <w:ind w:left="260"/>
+      </w:pPr>
+      <w:r>
+        <w:rPr>
+          <w:rFonts w:ascii="Calibri" w:cs="Calibri" w:eastAsia="Calibri" w:hAnsi="Calibri"/>
+          <w:color w:val="1B1F2A"/>
+          <w:sz w:val="22"/>
+          <w:szCs w:val="22"/>
+        </w:rPr>
+        <w:t xml:space="preserve">9.  One-page cheat sheet — print this one</w:t>
+      </w:r>
+    </w:p>
+    <w:p>
+      <w:pPr>
+        <w:spacing w:after="200"/>
+      </w:pPr>
+      <w:r>
+        <w:t xml:space="preserve"/>
+      </w:r>
+    </w:p>
+    <w:p>
+      <w:pPr>
+        <w:spacing w:after="120" w:before="0"/>
+      </w:pPr>
+      <w:r>
+        <w:rPr>
+          <w:rFonts w:ascii="Calibri" w:cs="Calibri" w:eastAsia="Calibri" w:hAnsi="Calibri"/>
+          <w:i/>
+          <w:iCs/>
+          <w:color w:val="6B7280"/>
+          <w:sz w:val="21"/>
+          <w:szCs w:val="21"/>
+        </w:rPr>
+        <w:t xml:space="preserve">In Word, the View menu has a Navigation Pane that lets you jump between these while you present.</w:t>
+      </w:r>
+    </w:p>
     <w:p>
       <w:r>
         <w:br w:type="page"/>
@@ -321,6 +461,9 @@
         <w:gridCol w:w="9172"/>
       </w:tblGrid>
       <w:tr>
+        <w:trPr>
+          <w:cantSplit/>
+        </w:trPr>
         <w:tc>
           <w:tcPr>
             <w:tcW w:type="dxa" w:w="9172"/>
@@ -668,6 +811,9 @@
         <w:gridCol w:w="9172"/>
       </w:tblGrid>
       <w:tr>
+        <w:trPr>
+          <w:cantSplit/>
+        </w:trPr>
         <w:tc>
           <w:tcPr>
             <w:tcW w:type="dxa" w:w="9172"/>
@@ -853,6 +999,9 @@
         <w:gridCol w:w="9172"/>
       </w:tblGrid>
       <w:tr>
+        <w:trPr>
+          <w:cantSplit/>
+        </w:trPr>
         <w:tc>
           <w:tcPr>
             <w:tcW w:type="dxa" w:w="9172"/>
@@ -942,6 +1091,9 @@
         <w:gridCol w:w="9172"/>
       </w:tblGrid>
       <w:tr>
+        <w:trPr>
+          <w:cantSplit/>
+        </w:trPr>
         <w:tc>
           <w:tcPr>
             <w:tcW w:type="dxa" w:w="9172"/>
@@ -1032,6 +1184,9 @@
         <w:gridCol w:w="9172"/>
       </w:tblGrid>
       <w:tr>
+        <w:trPr>
+          <w:cantSplit/>
+        </w:trPr>
         <w:tc>
           <w:tcPr>
             <w:tcW w:type="dxa" w:w="9172"/>
@@ -1107,6 +1262,9 @@
         <w:gridCol w:w="9172"/>
       </w:tblGrid>
       <w:tr>
+        <w:trPr>
+          <w:cantSplit/>
+        </w:trPr>
         <w:tc>
           <w:tcPr>
             <w:tcW w:type="dxa" w:w="9172"/>
@@ -1214,6 +1372,9 @@
         <w:gridCol w:w="9172"/>
       </w:tblGrid>
       <w:tr>
+        <w:trPr>
+          <w:cantSplit/>
+        </w:trPr>
         <w:tc>
           <w:tcPr>
             <w:tcW w:type="dxa" w:w="9172"/>
@@ -1304,6 +1465,9 @@
         <w:gridCol w:w="9172"/>
       </w:tblGrid>
       <w:tr>
+        <w:trPr>
+          <w:cantSplit/>
+        </w:trPr>
         <w:tc>
           <w:tcPr>
             <w:tcW w:type="dxa" w:w="9172"/>
@@ -1427,6 +1591,9 @@
         <w:gridCol w:w="9172"/>
       </w:tblGrid>
       <w:tr>
+        <w:trPr>
+          <w:cantSplit/>
+        </w:trPr>
         <w:tc>
           <w:tcPr>
             <w:tcW w:type="dxa" w:w="9172"/>
@@ -1499,6 +1666,9 @@
         <w:gridCol w:w="9172"/>
       </w:tblGrid>
       <w:tr>
+        <w:trPr>
+          <w:cantSplit/>
+        </w:trPr>
         <w:tc>
           <w:tcPr>
             <w:tcW w:type="dxa" w:w="9172"/>
@@ -1590,6 +1760,9 @@
         <w:gridCol w:w="9172"/>
       </w:tblGrid>
       <w:tr>
+        <w:trPr>
+          <w:cantSplit/>
+        </w:trPr>
         <w:tc>
           <w:tcPr>
             <w:tcW w:type="dxa" w:w="9172"/>
@@ -1662,6 +1835,9 @@
         <w:gridCol w:w="9172"/>
       </w:tblGrid>
       <w:tr>
+        <w:trPr>
+          <w:cantSplit/>
+        </w:trPr>
         <w:tc>
           <w:tcPr>
             <w:tcW w:type="dxa" w:w="9172"/>
@@ -1813,6 +1989,9 @@
         <w:gridCol w:w="9172"/>
       </w:tblGrid>
       <w:tr>
+        <w:trPr>
+          <w:cantSplit/>
+        </w:trPr>
         <w:tc>
           <w:tcPr>
             <w:tcW w:type="dxa" w:w="9172"/>
@@ -1908,6 +2087,9 @@
         <w:gridCol w:w="9172"/>
       </w:tblGrid>
       <w:tr>
+        <w:trPr>
+          <w:cantSplit/>
+        </w:trPr>
         <w:tc>
           <w:tcPr>
             <w:tcW w:type="dxa" w:w="9172"/>
@@ -2484,6 +2666,9 @@
         <w:gridCol w:w="9172"/>
       </w:tblGrid>
       <w:tr>
+        <w:trPr>
+          <w:cantSplit/>
+        </w:trPr>
         <w:tc>
           <w:tcPr>
             <w:tcW w:type="dxa" w:w="9172"/>
@@ -2665,6 +2850,9 @@
         <w:gridCol w:w="9172"/>
       </w:tblGrid>
       <w:tr>
+        <w:trPr>
+          <w:cantSplit/>
+        </w:trPr>
         <w:tc>
           <w:tcPr>
             <w:tcW w:type="dxa" w:w="9172"/>
@@ -2798,6 +2986,9 @@
         <w:gridCol w:w="9172"/>
       </w:tblGrid>
       <w:tr>
+        <w:trPr>
+          <w:cantSplit/>
+        </w:trPr>
         <w:tc>
           <w:tcPr>
             <w:tcW w:type="dxa" w:w="9172"/>
@@ -2934,6 +3125,9 @@
         <w:gridCol w:w="9172"/>
       </w:tblGrid>
       <w:tr>
+        <w:trPr>
+          <w:cantSplit/>
+        </w:trPr>
         <w:tc>
           <w:tcPr>
             <w:tcW w:type="dxa" w:w="9172"/>
@@ -3028,7 +3222,7 @@
           <w:sz w:val="21"/>
           <w:szCs w:val="21"/>
         </w:rPr>
-        <w:t xml:space="preserve">point at the </w:t>
+        <w:t xml:space="preserve">point at </w:t>
       </w:r>
       <w:r>
         <w:rPr>
@@ -3067,6 +3261,9 @@
         <w:gridCol w:w="9172"/>
       </w:tblGrid>
       <w:tr>
+        <w:trPr>
+          <w:cantSplit/>
+        </w:trPr>
         <w:tc>
           <w:tcPr>
             <w:tcW w:type="dxa" w:w="9172"/>
@@ -3141,6 +3338,9 @@
         <w:gridCol w:w="9172"/>
       </w:tblGrid>
       <w:tr>
+        <w:trPr>
+          <w:cantSplit/>
+        </w:trPr>
         <w:tc>
           <w:tcPr>
             <w:tcW w:type="dxa" w:w="9172"/>
@@ -3293,6 +3493,9 @@
         <w:gridCol w:w="9172"/>
       </w:tblGrid>
       <w:tr>
+        <w:trPr>
+          <w:cantSplit/>
+        </w:trPr>
         <w:tc>
           <w:tcPr>
             <w:tcW w:type="dxa" w:w="9172"/>
@@ -3426,6 +3629,9 @@
         <w:gridCol w:w="9172"/>
       </w:tblGrid>
       <w:tr>
+        <w:trPr>
+          <w:cantSplit/>
+        </w:trPr>
         <w:tc>
           <w:tcPr>
             <w:tcW w:type="dxa" w:w="9172"/>
@@ -3559,6 +3765,9 @@
         <w:gridCol w:w="9172"/>
       </w:tblGrid>
       <w:tr>
+        <w:trPr>
+          <w:cantSplit/>
+        </w:trPr>
         <w:tc>
           <w:tcPr>
             <w:tcW w:type="dxa" w:w="9172"/>
@@ -3709,6 +3918,9 @@
         <w:gridCol w:w="9172"/>
       </w:tblGrid>
       <w:tr>
+        <w:trPr>
+          <w:cantSplit/>
+        </w:trPr>
         <w:tc>
           <w:tcPr>
             <w:tcW w:type="dxa" w:w="9172"/>
@@ -3808,6 +4020,9 @@
         <w:gridCol w:w="9172"/>
       </w:tblGrid>
       <w:tr>
+        <w:trPr>
+          <w:cantSplit/>
+        </w:trPr>
         <w:tc>
           <w:tcPr>
             <w:tcW w:type="dxa" w:w="9172"/>
@@ -3927,6 +4142,9 @@
         <w:gridCol w:w="9172"/>
       </w:tblGrid>
       <w:tr>
+        <w:trPr>
+          <w:cantSplit/>
+        </w:trPr>
         <w:tc>
           <w:tcPr>
             <w:tcW w:type="dxa" w:w="9172"/>
@@ -4026,6 +4244,9 @@
         <w:gridCol w:w="9172"/>
       </w:tblGrid>
       <w:tr>
+        <w:trPr>
+          <w:cantSplit/>
+        </w:trPr>
         <w:tc>
           <w:tcPr>
             <w:tcW w:type="dxa" w:w="9172"/>
@@ -4165,6 +4386,9 @@
         <w:gridCol w:w="9172"/>
       </w:tblGrid>
       <w:tr>
+        <w:trPr>
+          <w:cantSplit/>
+        </w:trPr>
         <w:tc>
           <w:tcPr>
             <w:tcW w:type="dxa" w:w="9172"/>
@@ -4301,6 +4525,9 @@
         <w:gridCol w:w="9172"/>
       </w:tblGrid>
       <w:tr>
+        <w:trPr>
+          <w:cantSplit/>
+        </w:trPr>
         <w:tc>
           <w:tcPr>
             <w:tcW w:type="dxa" w:w="9172"/>
@@ -4420,6 +4647,9 @@
         <w:gridCol w:w="9172"/>
       </w:tblGrid>
       <w:tr>
+        <w:trPr>
+          <w:cantSplit/>
+        </w:trPr>
         <w:tc>
           <w:tcPr>
             <w:tcW w:type="dxa" w:w="9172"/>
@@ -4553,6 +4783,9 @@
         <w:gridCol w:w="9172"/>
       </w:tblGrid>
       <w:tr>
+        <w:trPr>
+          <w:cantSplit/>
+        </w:trPr>
         <w:tc>
           <w:tcPr>
             <w:tcW w:type="dxa" w:w="9172"/>
@@ -4692,6 +4925,9 @@
         <w:gridCol w:w="9172"/>
       </w:tblGrid>
       <w:tr>
+        <w:trPr>
+          <w:cantSplit/>
+        </w:trPr>
         <w:tc>
           <w:tcPr>
             <w:tcW w:type="dxa" w:w="9172"/>
@@ -4780,6 +5016,9 @@
         <w:gridCol w:w="9172"/>
       </w:tblGrid>
       <w:tr>
+        <w:trPr>
+          <w:cantSplit/>
+        </w:trPr>
         <w:tc>
           <w:tcPr>
             <w:tcW w:type="dxa" w:w="9172"/>
@@ -4970,6 +5209,9 @@
         <w:gridCol w:w="9172"/>
       </w:tblGrid>
       <w:tr>
+        <w:trPr>
+          <w:cantSplit/>
+        </w:trPr>
         <w:tc>
           <w:tcPr>
             <w:tcW w:type="dxa" w:w="9172"/>
@@ -5078,6 +5320,9 @@
         <w:gridCol w:w="9172"/>
       </w:tblGrid>
       <w:tr>
+        <w:trPr>
+          <w:cantSplit/>
+        </w:trPr>
         <w:tc>
           <w:tcPr>
             <w:tcW w:type="dxa" w:w="9172"/>
@@ -5217,6 +5462,9 @@
         <w:gridCol w:w="9172"/>
       </w:tblGrid>
       <w:tr>
+        <w:trPr>
+          <w:cantSplit/>
+        </w:trPr>
         <w:tc>
           <w:tcPr>
             <w:tcW w:type="dxa" w:w="9172"/>
@@ -6045,6 +6293,9 @@
         <w:gridCol w:w="9172"/>
       </w:tblGrid>
       <w:tr>
+        <w:trPr>
+          <w:cantSplit/>
+        </w:trPr>
         <w:tc>
           <w:tcPr>
             <w:tcW w:type="dxa" w:w="9172"/>
@@ -6294,6 +6545,9 @@
         <w:gridCol w:w="9172"/>
       </w:tblGrid>
       <w:tr>
+        <w:trPr>
+          <w:cantSplit/>
+        </w:trPr>
         <w:tc>
           <w:tcPr>
             <w:tcW w:type="dxa" w:w="9172"/>
@@ -6385,6 +6639,9 @@
         <w:gridCol w:w="9172"/>
       </w:tblGrid>
       <w:tr>
+        <w:trPr>
+          <w:cantSplit/>
+        </w:trPr>
         <w:tc>
           <w:tcPr>
             <w:tcW w:type="dxa" w:w="9172"/>
@@ -6476,6 +6733,9 @@
         <w:gridCol w:w="9172"/>
       </w:tblGrid>
       <w:tr>
+        <w:trPr>
+          <w:cantSplit/>
+        </w:trPr>
         <w:tc>
           <w:tcPr>
             <w:tcW w:type="dxa" w:w="9172"/>
@@ -6567,6 +6827,9 @@
         <w:gridCol w:w="9172"/>
       </w:tblGrid>
       <w:tr>
+        <w:trPr>
+          <w:cantSplit/>
+        </w:trPr>
         <w:tc>
           <w:tcPr>
             <w:tcW w:type="dxa" w:w="9172"/>
@@ -6658,6 +6921,9 @@
         <w:gridCol w:w="9172"/>
       </w:tblGrid>
       <w:tr>
+        <w:trPr>
+          <w:cantSplit/>
+        </w:trPr>
         <w:tc>
           <w:tcPr>
             <w:tcW w:type="dxa" w:w="9172"/>
@@ -6749,6 +7015,9 @@
         <w:gridCol w:w="9172"/>
       </w:tblGrid>
       <w:tr>
+        <w:trPr>
+          <w:cantSplit/>
+        </w:trPr>
         <w:tc>
           <w:tcPr>
             <w:tcW w:type="dxa" w:w="9172"/>
@@ -6840,6 +7109,9 @@
         <w:gridCol w:w="9172"/>
       </w:tblGrid>
       <w:tr>
+        <w:trPr>
+          <w:cantSplit/>
+        </w:trPr>
         <w:tc>
           <w:tcPr>
             <w:tcW w:type="dxa" w:w="9172"/>
@@ -7329,6 +7601,9 @@
         <w:gridCol w:w="9172"/>
       </w:tblGrid>
       <w:tr>
+        <w:trPr>
+          <w:cantSplit/>
+        </w:trPr>
         <w:tc>
           <w:tcPr>
             <w:tcW w:type="dxa" w:w="9172"/>
@@ -7453,6 +7728,9 @@
         <w:gridCol w:w="9172"/>
       </w:tblGrid>
       <w:tr>
+        <w:trPr>
+          <w:cantSplit/>
+        </w:trPr>
         <w:tc>
           <w:tcPr>
             <w:tcW w:type="dxa" w:w="9172"/>
@@ -7569,6 +7847,9 @@
         <w:gridCol w:w="9172"/>
       </w:tblGrid>
       <w:tr>
+        <w:trPr>
+          <w:cantSplit/>
+        </w:trPr>
         <w:tc>
           <w:tcPr>
             <w:tcW w:type="dxa" w:w="9172"/>
@@ -7605,6 +7886,7 @@
           <w:p>
             <w:pPr>
               <w:spacing w:after="100"/>
+              <w:ind w:left="260" w:hanging="260"/>
             </w:pPr>
             <w:r>
               <w:rPr>
@@ -7630,6 +7912,7 @@
           <w:p>
             <w:pPr>
               <w:spacing w:after="100"/>
+              <w:ind w:left="260" w:hanging="260"/>
             </w:pPr>
             <w:r>
               <w:rPr>
@@ -7655,6 +7938,7 @@
           <w:p>
             <w:pPr>
               <w:spacing w:after="100"/>
+              <w:ind w:left="260" w:hanging="260"/>
             </w:pPr>
             <w:r>
               <w:rPr>
@@ -7680,6 +7964,7 @@
           <w:p>
             <w:pPr>
               <w:spacing w:after="100"/>
+              <w:ind w:left="260" w:hanging="260"/>
             </w:pPr>
             <w:r>
               <w:rPr>
@@ -7705,6 +7990,7 @@
           <w:p>
             <w:pPr>
               <w:spacing w:after="0"/>
+              <w:ind w:left="260" w:hanging="260"/>
             </w:pPr>
             <w:r>
               <w:rPr>
@@ -7754,6 +8040,9 @@
         <w:gridCol w:w="9172"/>
       </w:tblGrid>
       <w:tr>
+        <w:trPr>
+          <w:cantSplit/>
+        </w:trPr>
         <w:tc>
           <w:tcPr>
             <w:tcW w:type="dxa" w:w="9172"/>
@@ -7884,6 +8173,9 @@
         <w:gridCol w:w="9172"/>
       </w:tblGrid>
       <w:tr>
+        <w:trPr>
+          <w:cantSplit/>
+        </w:trPr>
         <w:tc>
           <w:tcPr>
             <w:tcW w:type="dxa" w:w="9172"/>

</xml_diff>